<commit_message>
Update AquiferOpenBibleDictionary with extensive content revisions across languages for 2026-03-31 release
</commit_message>
<xml_diff>
--- a/arb/docx/007.content.docx
+++ b/arb/docx/007.content.docx
@@ -12321,6 +12321,641 @@
         <w:rPr>
           <w:lang w:val="ar_AE" w:bidi="ar_AE"/>
         </w:rPr>
+        <w:t>خادمة</w:t>
+      </w:r>
+      <w:r>
+        <w:rPr>
+          <w:lang w:val="ar_AE" w:bidi="ar_AE"/>
+        </w:rPr>
+      </w:r>
+    </w:p>
+    <w:p>
+      <w:pPr>
+        <w:bidi/>
+      </w:pPr>
+      <w:r>
+        <w:rPr>
+          <w:lang w:val="ar_AE" w:bidi="ar_AE"/>
+        </w:rPr>
+      </w:r>
+      <w:r>
+        <w:rPr>
+          <w:lang w:val="ar_AE" w:bidi="ar_AE"/>
+        </w:rPr>
+        <w:t>امرأة شابة غير مُتَزَوَّجة، غالبًا من طبقة الخَدَّم. في العهد القديم، تُتَرجَم خمس كلمات عبرية ذات معاني مختلفة بالكلمة الإنجليزية "خادمة".</w:t>
+      </w:r>
+    </w:p>
+    <w:p>
+      <w:pPr>
+        <w:bidi/>
+      </w:pPr>
+      <w:r>
+        <w:rPr>
+          <w:lang w:val="ar_AE" w:bidi="ar_AE"/>
+        </w:rPr>
+      </w:r>
+      <w:r>
+        <w:rPr>
+          <w:lang w:val="ar_AE" w:bidi="ar_AE"/>
+        </w:rPr>
+        <w:t>واحدة من تلك الكلمات هي "</w:t>
+      </w:r>
+      <w:r>
+        <w:rPr>
+          <w:i/>
+          <w:lang w:val="ar_AE" w:bidi="ar_AE"/>
+        </w:rPr>
+        <w:t>أَمَة</w:t>
+      </w:r>
+      <w:r>
+        <w:rPr>
+          <w:lang w:val="ar_AE" w:bidi="ar_AE"/>
+        </w:rPr>
+        <w:t>". تشمل الترجمات العربية المختلفة لهذه الكلمة على الآتي: أَمَة، جارية، عبدة، مملوكة، قَيْنَة.</w:t>
+      </w:r>
+    </w:p>
+    <w:p>
+      <w:pPr>
+        <w:bidi/>
+      </w:pPr>
+      <w:r>
+        <w:rPr>
+          <w:lang w:val="ar_AE" w:bidi="ar_AE"/>
+        </w:rPr>
+      </w:r>
+      <w:r>
+        <w:rPr>
+          <w:lang w:val="ar_AE" w:bidi="ar_AE"/>
+        </w:rPr>
+        <w:t xml:space="preserve">مصطلح آخر هو </w:t>
+      </w:r>
+      <w:r>
+        <w:rPr>
+          <w:i/>
+          <w:lang w:val="ar_AE" w:bidi="ar_AE"/>
+        </w:rPr>
+        <w:t>شيفتشاه</w:t>
+      </w:r>
+      <w:r>
+        <w:rPr>
+          <w:lang w:val="ar_AE" w:bidi="ar_AE"/>
+        </w:rPr>
+        <w:t>. هذه الكلمة العبرية لها معنى مماثل لـلكلمة "</w:t>
+      </w:r>
+      <w:r>
+        <w:rPr>
+          <w:i/>
+          <w:lang w:val="ar_AE" w:bidi="ar_AE"/>
+        </w:rPr>
+        <w:t>أمة</w:t>
+      </w:r>
+      <w:r>
+        <w:rPr>
+          <w:lang w:val="ar_AE" w:bidi="ar_AE"/>
+        </w:rPr>
+        <w:t>". تُترْجَم بهذه الطرق، خادمة، وامرأة عبدة، وجارية. وعلى الرغم من أن كُلٍّ من شيفتشاه وآمة تشير إلى أنثى عبدة، شيفتشاه على ما يبدو تشير إلى وجود علاقة أوثق بين العبد والعائلة التي تنتمي إليها. وفي وقت الآباء هذا المصطلح في الأغلب يستخدم للإشارة إلى العبيد الإناث عمومًا وعلى وجه التحديد إلى المحظيات اللواتي كن أيضًا عبيدًا لزوجات أحرار لأزواجهن (</w:t>
+      </w:r>
+      <w:hyperlink r:id="rId369">
+        <w:r>
+          <w:rPr>
+            <w:lang w:val="ar_AE" w:bidi="ar_AE"/>
+          </w:rPr>
+          <w:rPr>
+            <w:color w:val="0000EE"/>
+            <w:u w:val="single"/>
+          </w:rPr>
+          <w:t>تكوين 16</w:t>
+        </w:r>
+      </w:hyperlink>
+      <w:r>
+        <w:rPr>
+          <w:lang w:val="ar_AE" w:bidi="ar_AE"/>
+        </w:rPr>
+        <w:t xml:space="preserve">، </w:t>
+      </w:r>
+      <w:hyperlink r:id="rId370">
+        <w:r>
+          <w:rPr>
+            <w:lang w:val="ar_AE" w:bidi="ar_AE"/>
+          </w:rPr>
+          <w:rPr>
+            <w:color w:val="0000EE"/>
+            <w:u w:val="single"/>
+          </w:rPr>
+          <w:t>29–30</w:t>
+        </w:r>
+      </w:hyperlink>
+      <w:r>
+        <w:rPr>
+          <w:lang w:val="ar_AE" w:bidi="ar_AE"/>
+        </w:rPr>
+        <w:t>).</w:t>
+      </w:r>
+    </w:p>
+    <w:p>
+      <w:pPr>
+        <w:bidi/>
+      </w:pPr>
+      <w:r>
+        <w:rPr>
+          <w:lang w:val="ar_AE" w:bidi="ar_AE"/>
+        </w:rPr>
+      </w:r>
+      <w:r>
+        <w:rPr>
+          <w:lang w:val="ar_AE" w:bidi="ar_AE"/>
+        </w:rPr>
+        <w:t>لا يزال مصطلح عبري آخر يعني "عذراء" وهو "</w:t>
+      </w:r>
+      <w:r>
+        <w:rPr>
+          <w:i/>
+          <w:lang w:val="ar_AE" w:bidi="ar_AE"/>
+        </w:rPr>
+        <w:t>بِتولاه</w:t>
+      </w:r>
+      <w:r>
+        <w:rPr>
+          <w:lang w:val="ar_AE" w:bidi="ar_AE"/>
+        </w:rPr>
+        <w:t>". يشير هذا المصطلح بالتحديد إلى الفتاة العذراء، أو الشابة التي في سن الزواج (</w:t>
+      </w:r>
+      <w:hyperlink r:id="rId371">
+        <w:r>
+          <w:rPr>
+            <w:lang w:val="ar_AE" w:bidi="ar_AE"/>
+          </w:rPr>
+          <w:rPr>
+            <w:color w:val="0000EE"/>
+            <w:u w:val="single"/>
+          </w:rPr>
+          <w:t>تكوين 24: 16</w:t>
+        </w:r>
+      </w:hyperlink>
+      <w:r>
+        <w:rPr>
+          <w:lang w:val="ar_AE" w:bidi="ar_AE"/>
+        </w:rPr>
+        <w:t xml:space="preserve">؛ </w:t>
+      </w:r>
+      <w:hyperlink r:id="rId372">
+        <w:r>
+          <w:rPr>
+            <w:lang w:val="ar_AE" w:bidi="ar_AE"/>
+          </w:rPr>
+          <w:rPr>
+            <w:color w:val="0000EE"/>
+            <w:u w:val="single"/>
+          </w:rPr>
+          <w:t>خروج 22: 16</w:t>
+        </w:r>
+      </w:hyperlink>
+      <w:r>
+        <w:rPr>
+          <w:lang w:val="ar_AE" w:bidi="ar_AE"/>
+        </w:rPr>
+        <w:t>). كان أنبياء العهد القديم يستخدمون أحيانًا هذا المصطلح مجازيًّا للإشارة إلى مدينة أو بلد على أنها "عذراء" (</w:t>
+      </w:r>
+      <w:hyperlink r:id="rId373">
+        <w:r>
+          <w:rPr>
+            <w:lang w:val="ar_AE" w:bidi="ar_AE"/>
+          </w:rPr>
+          <w:rPr>
+            <w:color w:val="0000EE"/>
+            <w:u w:val="single"/>
+          </w:rPr>
+          <w:t>إرميا 31: 21</w:t>
+        </w:r>
+      </w:hyperlink>
+      <w:r>
+        <w:rPr>
+          <w:lang w:val="ar_AE" w:bidi="ar_AE"/>
+        </w:rPr>
+        <w:t xml:space="preserve">؛ </w:t>
+      </w:r>
+      <w:hyperlink r:id="rId374">
+        <w:r>
+          <w:rPr>
+            <w:lang w:val="ar_AE" w:bidi="ar_AE"/>
+          </w:rPr>
+          <w:rPr>
+            <w:color w:val="0000EE"/>
+            <w:u w:val="single"/>
+          </w:rPr>
+          <w:t>عاموس 5: 2</w:t>
+        </w:r>
+      </w:hyperlink>
+      <w:r>
+        <w:rPr>
+          <w:lang w:val="ar_AE" w:bidi="ar_AE"/>
+        </w:rPr>
+        <w:t>).</w:t>
+      </w:r>
+    </w:p>
+    <w:p>
+      <w:pPr>
+        <w:bidi/>
+      </w:pPr>
+      <w:r>
+        <w:rPr>
+          <w:lang w:val="ar_AE" w:bidi="ar_AE"/>
+        </w:rPr>
+      </w:r>
+      <w:r>
+        <w:rPr>
+          <w:lang w:val="ar_AE" w:bidi="ar_AE"/>
+        </w:rPr>
+        <w:t xml:space="preserve">كلمة أخرى هي، </w:t>
+      </w:r>
+      <w:r>
+        <w:rPr>
+          <w:i/>
+          <w:lang w:val="ar_AE" w:bidi="ar_AE"/>
+        </w:rPr>
+        <w:t>نعَارَة</w:t>
+      </w:r>
+      <w:r>
+        <w:rPr>
+          <w:lang w:val="ar_AE" w:bidi="ar_AE"/>
+        </w:rPr>
+        <w:t>، في حد ذاتها تُستخدَم بعدة طرق في العهد القديم. غالبًا ما تشير إلى فتاة غير متزوجة (</w:t>
+      </w:r>
+      <w:hyperlink r:id="rId375">
+        <w:r>
+          <w:rPr>
+            <w:lang w:val="ar_AE" w:bidi="ar_AE"/>
+          </w:rPr>
+          <w:rPr>
+            <w:color w:val="0000EE"/>
+            <w:u w:val="single"/>
+          </w:rPr>
+          <w:t>أستير 2: 4</w:t>
+        </w:r>
+      </w:hyperlink>
+      <w:r>
+        <w:rPr>
+          <w:lang w:val="ar_AE" w:bidi="ar_AE"/>
+        </w:rPr>
+        <w:t>)؛ وفي أوقات أخرى تُستخدَم في الحديث عن الجواري (</w:t>
+      </w:r>
+      <w:hyperlink r:id="rId376">
+        <w:r>
+          <w:rPr>
+            <w:lang w:val="ar_AE" w:bidi="ar_AE"/>
+          </w:rPr>
+          <w:rPr>
+            <w:color w:val="0000EE"/>
+            <w:u w:val="single"/>
+          </w:rPr>
+          <w:t>أستير 4: 4</w:t>
+        </w:r>
+      </w:hyperlink>
+      <w:r>
+        <w:rPr>
+          <w:lang w:val="ar_AE" w:bidi="ar_AE"/>
+        </w:rPr>
+        <w:t xml:space="preserve">؛ </w:t>
+      </w:r>
+      <w:hyperlink r:id="rId377">
+        <w:r>
+          <w:rPr>
+            <w:lang w:val="ar_AE" w:bidi="ar_AE"/>
+          </w:rPr>
+          <w:rPr>
+            <w:color w:val="0000EE"/>
+            <w:u w:val="single"/>
+          </w:rPr>
+          <w:t>راعوث 2: 23</w:t>
+        </w:r>
+      </w:hyperlink>
+      <w:r>
+        <w:rPr>
+          <w:lang w:val="ar_AE" w:bidi="ar_AE"/>
+        </w:rPr>
+        <w:t xml:space="preserve">). هذه الكلمة نفسها هي الأصل لاسم امرأة (نَعْرَةُ، زوجة أَشْحُور، في </w:t>
+      </w:r>
+      <w:hyperlink r:id="rId378">
+        <w:r>
+          <w:rPr>
+            <w:lang w:val="ar_AE" w:bidi="ar_AE"/>
+          </w:rPr>
+          <w:rPr>
+            <w:color w:val="0000EE"/>
+            <w:u w:val="single"/>
+          </w:rPr>
+          <w:t>1 أخبار الأيام 4: 5–6</w:t>
+        </w:r>
+      </w:hyperlink>
+      <w:r>
+        <w:rPr>
+          <w:lang w:val="ar_AE" w:bidi="ar_AE"/>
+        </w:rPr>
+        <w:t>) ومدينة في أَفْرَايِم بالقرب من أريحا (</w:t>
+      </w:r>
+      <w:hyperlink r:id="rId379">
+        <w:r>
+          <w:rPr>
+            <w:lang w:val="ar_AE" w:bidi="ar_AE"/>
+          </w:rPr>
+          <w:rPr>
+            <w:color w:val="0000EE"/>
+            <w:u w:val="single"/>
+          </w:rPr>
+          <w:t>يشوع 16: 7</w:t>
+        </w:r>
+      </w:hyperlink>
+      <w:r>
+        <w:rPr>
+          <w:lang w:val="ar_AE" w:bidi="ar_AE"/>
+        </w:rPr>
+        <w:t>).</w:t>
+      </w:r>
+    </w:p>
+    <w:p>
+      <w:pPr>
+        <w:bidi/>
+      </w:pPr>
+      <w:r>
+        <w:rPr>
+          <w:lang w:val="ar_AE" w:bidi="ar_AE"/>
+        </w:rPr>
+      </w:r>
+      <w:r>
+        <w:rPr>
+          <w:lang w:val="ar_AE" w:bidi="ar_AE"/>
+        </w:rPr>
+        <w:t>لسنوات عديدة يحاط الجدل بمعنى"</w:t>
+      </w:r>
+      <w:r>
+        <w:rPr>
+          <w:i/>
+          <w:lang w:val="ar_AE" w:bidi="ar_AE"/>
+        </w:rPr>
+        <w:t>علما</w:t>
+      </w:r>
+      <w:r>
+        <w:rPr>
+          <w:lang w:val="ar_AE" w:bidi="ar_AE"/>
+        </w:rPr>
+        <w:t xml:space="preserve">"، اللفظة التي تعني عذراء ومستخدمة في </w:t>
+      </w:r>
+      <w:hyperlink r:id="rId380">
+        <w:r>
+          <w:rPr>
+            <w:lang w:val="ar_AE" w:bidi="ar_AE"/>
+          </w:rPr>
+          <w:rPr>
+            <w:color w:val="0000EE"/>
+            <w:u w:val="single"/>
+          </w:rPr>
+          <w:t>إشعياء 7: 14</w:t>
+        </w:r>
+      </w:hyperlink>
+      <w:r>
+        <w:rPr>
+          <w:lang w:val="ar_AE" w:bidi="ar_AE"/>
+        </w:rPr>
+        <w:t xml:space="preserve">. ينشأ هذا النزاع بسبب التعريفات المتنوعة للفظة في جميع أنحاء العهد القديم ("بنت"، "امرأة شابة"، "امرأة شابة في سن الزواج، ومن المفترض أنها عذراء"). وحده السياق هو الذي يستطيع أن يحدِّد بدقة معنى "علما" في أيِّ مثال مُعَطَّى به. بالنظر إلى </w:t>
+      </w:r>
+      <w:hyperlink r:id="rId380">
+        <w:r>
+          <w:rPr>
+            <w:lang w:val="ar_AE" w:bidi="ar_AE"/>
+          </w:rPr>
+          <w:rPr>
+            <w:color w:val="0000EE"/>
+            <w:u w:val="single"/>
+          </w:rPr>
+          <w:t>إشعياء 7: 14</w:t>
+        </w:r>
+      </w:hyperlink>
+      <w:r>
+        <w:rPr>
+          <w:lang w:val="ar_AE" w:bidi="ar_AE"/>
+        </w:rPr>
+        <w:t xml:space="preserve"> من منظور العهد الجديد، فإن "علما" هي إشارة إلى مريم العذراء، أم يسوع (اُنْظُرْ </w:t>
+      </w:r>
+      <w:hyperlink r:id="rId381">
+        <w:r>
+          <w:rPr>
+            <w:lang w:val="ar_AE" w:bidi="ar_AE"/>
+          </w:rPr>
+          <w:rPr>
+            <w:color w:val="0000EE"/>
+            <w:u w:val="single"/>
+          </w:rPr>
+          <w:t>مَتَّى 1: 23</w:t>
+        </w:r>
+      </w:hyperlink>
+      <w:r>
+        <w:rPr>
+          <w:lang w:val="ar_AE" w:bidi="ar_AE"/>
+        </w:rPr>
+        <w:t>).</w:t>
+      </w:r>
+    </w:p>
+    <w:p>
+      <w:pPr>
+        <w:bidi/>
+      </w:pPr>
+      <w:r>
+        <w:rPr>
+          <w:lang w:val="ar_AE" w:bidi="ar_AE"/>
+        </w:rPr>
+      </w:r>
+      <w:r>
+        <w:rPr>
+          <w:lang w:val="ar_AE" w:bidi="ar_AE"/>
+        </w:rPr>
+        <w:t>تُرَجَّمت عدة كلمات يونانيَّة إلى "عذراء" في العهد الجديد الإنجليزي. معنى كلمة "كوراسيون" هو ببساطة "بنت"، "فتاة صغيرة"، أو "عذراء" (</w:t>
+      </w:r>
+      <w:hyperlink r:id="rId382">
+        <w:r>
+          <w:rPr>
+            <w:lang w:val="ar_AE" w:bidi="ar_AE"/>
+          </w:rPr>
+          <w:rPr>
+            <w:color w:val="0000EE"/>
+            <w:u w:val="single"/>
+          </w:rPr>
+          <w:t>مَتَّى 9: 24–25</w:t>
+        </w:r>
+      </w:hyperlink>
+      <w:r>
+        <w:rPr>
+          <w:lang w:val="ar_AE" w:bidi="ar_AE"/>
+        </w:rPr>
+        <w:t>). كلمة أخرى هي "</w:t>
+      </w:r>
+      <w:r>
+        <w:rPr>
+          <w:i/>
+          <w:lang w:val="ar_AE" w:bidi="ar_AE"/>
+        </w:rPr>
+        <w:t>بايدسكي</w:t>
+      </w:r>
+      <w:r>
+        <w:rPr>
+          <w:lang w:val="ar_AE" w:bidi="ar_AE"/>
+        </w:rPr>
+        <w:t>"، والتي تُشير في الأصل إلى "امرأة شابة" لكنَّها أصبحت لاحقًا تعني "عبدة" أو "خادمة"، أو "فتاة خادمة" (</w:t>
+      </w:r>
+      <w:hyperlink r:id="rId383">
+        <w:r>
+          <w:rPr>
+            <w:lang w:val="ar_AE" w:bidi="ar_AE"/>
+          </w:rPr>
+          <w:rPr>
+            <w:color w:val="0000EE"/>
+            <w:u w:val="single"/>
+          </w:rPr>
+          <w:t>مَرْقُس 14: 66</w:t>
+        </w:r>
+      </w:hyperlink>
+      <w:r>
+        <w:rPr>
+          <w:lang w:val="ar_AE" w:bidi="ar_AE"/>
+        </w:rPr>
+        <w:t xml:space="preserve">؛ </w:t>
+      </w:r>
+      <w:hyperlink r:id="rId384">
+        <w:r>
+          <w:rPr>
+            <w:lang w:val="ar_AE" w:bidi="ar_AE"/>
+          </w:rPr>
+          <w:rPr>
+            <w:color w:val="0000EE"/>
+            <w:u w:val="single"/>
+          </w:rPr>
+          <w:t>لوقا 12: 45</w:t>
+        </w:r>
+      </w:hyperlink>
+      <w:r>
+        <w:rPr>
+          <w:lang w:val="ar_AE" w:bidi="ar_AE"/>
+        </w:rPr>
+        <w:t>). إنه تصغير كلمة "بايس" (وهي كلمة يونانية تشير إلى "فتاة صغيرة"، أو "عذراء"، أو "طفلة") (</w:t>
+      </w:r>
+      <w:hyperlink r:id="rId385">
+        <w:r>
+          <w:rPr>
+            <w:lang w:val="ar_AE" w:bidi="ar_AE"/>
+          </w:rPr>
+          <w:rPr>
+            <w:color w:val="0000EE"/>
+            <w:u w:val="single"/>
+          </w:rPr>
+          <w:t>لوقا 8: 51، 54</w:t>
+        </w:r>
+      </w:hyperlink>
+      <w:r>
+        <w:rPr>
+          <w:lang w:val="ar_AE" w:bidi="ar_AE"/>
+        </w:rPr>
+        <w:t>). الكلمة اليونانية "نِمْفِه" التي تعني "الزوجة الشابة" و"العروس" و"الكنَّة" (</w:t>
+      </w:r>
+      <w:hyperlink r:id="rId386">
+        <w:r>
+          <w:rPr>
+            <w:lang w:val="ar_AE" w:bidi="ar_AE"/>
+          </w:rPr>
+          <w:rPr>
+            <w:color w:val="0000EE"/>
+            <w:u w:val="single"/>
+          </w:rPr>
+          <w:t>لوقا 12: 53</w:t>
+        </w:r>
+      </w:hyperlink>
+      <w:r>
+        <w:rPr>
+          <w:lang w:val="ar_AE" w:bidi="ar_AE"/>
+        </w:rPr>
+        <w:t xml:space="preserve">؛ </w:t>
+      </w:r>
+      <w:hyperlink r:id="rId387">
+        <w:r>
+          <w:rPr>
+            <w:lang w:val="ar_AE" w:bidi="ar_AE"/>
+          </w:rPr>
+          <w:rPr>
+            <w:color w:val="0000EE"/>
+            <w:u w:val="single"/>
+          </w:rPr>
+          <w:t>رؤيا 21: 2</w:t>
+        </w:r>
+      </w:hyperlink>
+      <w:r>
+        <w:rPr>
+          <w:lang w:val="ar_AE" w:bidi="ar_AE"/>
+        </w:rPr>
+        <w:t>). وأيضًا "بارثينوس" هو المصطلح اليوناني المعتاد الذي يعني "عذراء" ويَرِد 14 مَرَّة في العهد الجديد.</w:t>
+      </w:r>
+    </w:p>
+    <w:p>
+      <w:pPr>
+        <w:bidi/>
+      </w:pPr>
+      <w:r>
+        <w:rPr>
+          <w:lang w:val="ar_AE" w:bidi="ar_AE"/>
+        </w:rPr>
+      </w:r>
+      <w:r>
+        <w:rPr>
+          <w:i/>
+          <w:lang w:val="ar_AE" w:bidi="ar_AE"/>
+        </w:rPr>
+        <w:t>انظر أيضًا</w:t>
+      </w:r>
+      <w:r>
+        <w:rPr>
+          <w:lang w:val="ar_AE" w:bidi="ar_AE"/>
+        </w:rPr>
+        <w:t xml:space="preserve"> </w:t>
+      </w:r>
+      <w:r>
+        <w:rPr>
+          <w:lang w:val="ar_AE" w:bidi="ar_AE"/>
+        </w:rPr>
+        <w:t>العبد، العبودية</w:t>
+      </w:r>
+      <w:r>
+        <w:rPr>
+          <w:lang w:val="ar_AE" w:bidi="ar_AE"/>
+        </w:rPr>
+        <w:t>.</w:t>
+      </w:r>
+      <w:r>
+        <w:rPr>
+          <w:lang w:val="ar_AE" w:bidi="ar_AE"/>
+        </w:rPr>
+      </w:r>
+      <w:r>
+        <w:rPr>
+          <w:lang w:val="ar_AE" w:bidi="ar_AE"/>
+        </w:rPr>
+      </w:r>
+    </w:p>
+    <w:p>
+      <w:pPr>
+        <w:bidi/>
+      </w:pPr>
+      <w:r>
+        <w:rPr>
+          <w:lang w:val="ar_AE" w:bidi="ar_AE"/>
+        </w:rPr>
+      </w:r>
+    </w:p>
+    <w:p>
+      <w:pPr>
+        <w:pStyle w:val="Heading2"/>
+        <w:bidi/>
+      </w:pPr>
+      <w:r>
+        <w:rPr>
+          <w:lang w:val="ar_AE" w:bidi="ar_AE"/>
+        </w:rPr>
         <w:t>خادم/عبد الرب</w:t>
       </w:r>
       <w:r>
@@ -12360,7 +12995,7 @@
         </w:rPr>
         <w:t xml:space="preserve">يُعرّف </w:t>
       </w:r>
-      <w:hyperlink r:id="rId369">
+      <w:hyperlink r:id="rId388">
         <w:r>
           <w:rPr>
             <w:lang w:val="ar_AE" w:bidi="ar_AE"/>
@@ -12378,7 +13013,7 @@
         </w:rPr>
         <w:t xml:space="preserve"> هذه الخدمة العليا بأنها شيء ممنوح بنعمة الله: "وَأَمَّا أَنْتَ يَا إِسْرَائِيلُ عَبْدِي، يَا يَعْقُوبُ ٱلَّذِي ٱخْتَرْتُهُ...، ٱلَّذِي أَمْسَكْتُهُ مِنْ أَطْرَافِ ٱلْأَرْضِ، وَمِنْ أَقْطَارِهَا دَعَوْتُهُ، وَقُلْتُ لَكَ: أَنْتَ عَبْدِيَ....". وهكذا يُطلق هذا اللقب على أبطال الإيمان والعمل - على الآباء (</w:t>
       </w:r>
-      <w:hyperlink r:id="rId370">
+      <w:hyperlink r:id="rId389">
         <w:r>
           <w:rPr>
             <w:lang w:val="ar_AE" w:bidi="ar_AE"/>
@@ -12396,7 +13031,7 @@
         </w:rPr>
         <w:t xml:space="preserve">؛ </w:t>
       </w:r>
-      <w:hyperlink r:id="rId371">
+      <w:hyperlink r:id="rId390">
         <w:r>
           <w:rPr>
             <w:lang w:val="ar_AE" w:bidi="ar_AE"/>
@@ -12414,7 +13049,7 @@
         </w:rPr>
         <w:t xml:space="preserve">؛ </w:t>
       </w:r>
-      <w:hyperlink r:id="rId372">
+      <w:hyperlink r:id="rId391">
         <w:r>
           <w:rPr>
             <w:lang w:val="ar_AE" w:bidi="ar_AE"/>
@@ -12432,7 +13067,7 @@
         </w:rPr>
         <w:t>)، وعلى موسى (</w:t>
       </w:r>
-      <w:hyperlink r:id="rId373">
+      <w:hyperlink r:id="rId392">
         <w:r>
           <w:rPr>
             <w:lang w:val="ar_AE" w:bidi="ar_AE"/>
@@ -12450,7 +13085,7 @@
         </w:rPr>
         <w:t xml:space="preserve">؛ </w:t>
       </w:r>
-      <w:hyperlink r:id="rId374">
+      <w:hyperlink r:id="rId393">
         <w:r>
           <w:rPr>
             <w:lang w:val="ar_AE" w:bidi="ar_AE"/>
@@ -12468,7 +13103,7 @@
         </w:rPr>
         <w:t>)، وعلى داود (</w:t>
       </w:r>
-      <w:hyperlink r:id="rId375">
+      <w:hyperlink r:id="rId394">
         <w:r>
           <w:rPr>
             <w:lang w:val="ar_AE" w:bidi="ar_AE"/>
@@ -12486,7 +13121,7 @@
         </w:rPr>
         <w:t xml:space="preserve">؛ </w:t>
       </w:r>
-      <w:hyperlink r:id="rId376">
+      <w:hyperlink r:id="rId395">
         <w:r>
           <w:rPr>
             <w:lang w:val="ar_AE" w:bidi="ar_AE"/>
@@ -12504,7 +13139,7 @@
         </w:rPr>
         <w:t>؛</w:t>
       </w:r>
-      <w:hyperlink r:id="rId377">
+      <w:hyperlink r:id="rId396">
         <w:r>
           <w:rPr>
             <w:lang w:val="ar_AE" w:bidi="ar_AE"/>
@@ -12522,7 +13157,7 @@
         </w:rPr>
         <w:t>) ونسله (حَزْقِيَا، إِيلَاكَم، زربابل-</w:t>
       </w:r>
-      <w:hyperlink r:id="rId378">
+      <w:hyperlink r:id="rId397">
         <w:r>
           <w:rPr>
             <w:lang w:val="ar_AE" w:bidi="ar_AE"/>
@@ -12540,7 +13175,7 @@
         </w:rPr>
         <w:t>)، وعلى الأنبياء (</w:t>
       </w:r>
-      <w:hyperlink r:id="rId379">
+      <w:hyperlink r:id="rId398">
         <w:r>
           <w:rPr>
             <w:lang w:val="ar_AE" w:bidi="ar_AE"/>
@@ -12558,7 +13193,7 @@
         </w:rPr>
         <w:t xml:space="preserve">؛ </w:t>
       </w:r>
-      <w:hyperlink r:id="rId380">
+      <w:hyperlink r:id="rId399">
         <w:r>
           <w:rPr>
             <w:lang w:val="ar_AE" w:bidi="ar_AE"/>
@@ -12576,7 +13211,7 @@
         </w:rPr>
         <w:t>)، وعلى بني إسرائيل الأمناء الآخرين، مثل يشوع وكَالب (</w:t>
       </w:r>
-      <w:hyperlink r:id="rId381">
+      <w:hyperlink r:id="rId400">
         <w:r>
           <w:rPr>
             <w:lang w:val="ar_AE" w:bidi="ar_AE"/>
@@ -12594,7 +13229,7 @@
         </w:rPr>
         <w:t xml:space="preserve">؛ </w:t>
       </w:r>
-      <w:hyperlink r:id="rId382">
+      <w:hyperlink r:id="rId401">
         <w:r>
           <w:rPr>
             <w:lang w:val="ar_AE" w:bidi="ar_AE"/>
@@ -12612,7 +13247,7 @@
         </w:rPr>
         <w:t xml:space="preserve">؛ </w:t>
       </w:r>
-      <w:hyperlink r:id="rId383">
+      <w:hyperlink r:id="rId402">
         <w:r>
           <w:rPr>
             <w:lang w:val="ar_AE" w:bidi="ar_AE"/>
@@ -12646,7 +13281,7 @@
         </w:rPr>
         <w:t xml:space="preserve">أنبياء غير إشعياء يستخدمون هذا المصطلح، لكن زكريا فوده من انضم إليه في إعطاء تنبؤ مسياني واضح لهذا الاسم. يقول </w:t>
       </w:r>
-      <w:hyperlink r:id="rId384">
+      <w:hyperlink r:id="rId403">
         <w:r>
           <w:rPr>
             <w:lang w:val="ar_AE" w:bidi="ar_AE"/>
@@ -12664,7 +13299,7 @@
         </w:rPr>
         <w:t xml:space="preserve"> "فَٱسْمَعْ يَا يَهُوشَعُ ٱلْكَاهِنُ ٱلْعَظِيمُ أَنْتَ وَرُفَقَاؤُكَ ٱلْجَالِسُونَ أَمَامَكَ، لِأَنَّهُمْ رِجَالُ آيَةٍ، لِأَنِّي هَأَنَذَا آتِي بِعَبْدِي «ٱلْغُصْنِ»". قد يرى البعض زَرْبَابَل على أنه الفرد المقصود هنا (قارن </w:t>
       </w:r>
-      <w:hyperlink r:id="rId385">
+      <w:hyperlink r:id="rId404">
         <w:r>
           <w:rPr>
             <w:lang w:val="ar_AE" w:bidi="ar_AE"/>
@@ -12682,7 +13317,7 @@
         </w:rPr>
         <w:t>)؛ مع ذلك، فإن استخدام "غُصن" هو مَسِيَّاني بالتأكيد في إشعياء (</w:t>
       </w:r>
-      <w:hyperlink r:id="rId386">
+      <w:hyperlink r:id="rId405">
         <w:r>
           <w:rPr>
             <w:lang w:val="ar_AE" w:bidi="ar_AE"/>
@@ -12700,7 +13335,7 @@
         </w:rPr>
         <w:t>) وإرميا (</w:t>
       </w:r>
-      <w:hyperlink r:id="rId387">
+      <w:hyperlink r:id="rId406">
         <w:r>
           <w:rPr>
             <w:lang w:val="ar_AE" w:bidi="ar_AE"/>
@@ -12763,7 +13398,7 @@
         </w:rPr>
         <w:t>إن "كعقيدة المسيح الخادم" يزخر بها سفر أعمال الرسل (</w:t>
       </w:r>
-      <w:hyperlink r:id="rId388">
+      <w:hyperlink r:id="rId407">
         <w:r>
           <w:rPr>
             <w:lang w:val="ar_AE" w:bidi="ar_AE"/>
@@ -12781,7 +13416,7 @@
         </w:rPr>
         <w:t xml:space="preserve">؛ </w:t>
       </w:r>
-      <w:hyperlink r:id="rId389">
+      <w:hyperlink r:id="rId408">
         <w:r>
           <w:rPr>
             <w:lang w:val="ar_AE" w:bidi="ar_AE"/>
@@ -12799,7 +13434,7 @@
         </w:rPr>
         <w:t xml:space="preserve">)، ورسالة ١ بطرس، مع شواهد عديدة في الأناجيل. لم يقتبس الرب يسوع نفسه </w:t>
       </w:r>
-      <w:hyperlink r:id="rId390">
+      <w:hyperlink r:id="rId409">
         <w:r>
           <w:rPr>
             <w:lang w:val="ar_AE" w:bidi="ar_AE"/>
@@ -12817,7 +13452,7 @@
         </w:rPr>
         <w:t xml:space="preserve"> صراحةً إلا في </w:t>
       </w:r>
-      <w:hyperlink r:id="rId391">
+      <w:hyperlink r:id="rId410">
         <w:r>
           <w:rPr>
             <w:lang w:val="ar_AE" w:bidi="ar_AE"/>
@@ -12835,7 +13470,7 @@
         </w:rPr>
         <w:t xml:space="preserve">، لكن يبدو أنه يُلمح إلى ذلك في </w:t>
       </w:r>
-      <w:hyperlink r:id="rId392">
+      <w:hyperlink r:id="rId411">
         <w:r>
           <w:rPr>
             <w:lang w:val="ar_AE" w:bidi="ar_AE"/>
@@ -12853,7 +13488,7 @@
         </w:rPr>
         <w:t xml:space="preserve">؛ وربما </w:t>
       </w:r>
-      <w:hyperlink r:id="rId393">
+      <w:hyperlink r:id="rId412">
         <w:r>
           <w:rPr>
             <w:lang w:val="ar_AE" w:bidi="ar_AE"/>
@@ -12871,7 +13506,7 @@
         </w:rPr>
         <w:t>. لا يشدد بطرس على المعاناة الفدائية النيابية (</w:t>
       </w:r>
-      <w:hyperlink r:id="rId394">
+      <w:hyperlink r:id="rId413">
         <w:r>
           <w:rPr>
             <w:lang w:val="ar_AE" w:bidi="ar_AE"/>
@@ -12889,7 +13524,7 @@
         </w:rPr>
         <w:t xml:space="preserve">؛ </w:t>
       </w:r>
-      <w:hyperlink r:id="rId395">
+      <w:hyperlink r:id="rId414">
         <w:r>
           <w:rPr>
             <w:lang w:val="ar_AE" w:bidi="ar_AE"/>
@@ -12907,7 +13542,7 @@
         </w:rPr>
         <w:t xml:space="preserve">) فحسب، بل يبدو أنه يسلط الضوء على موضوع </w:t>
       </w:r>
-      <w:hyperlink r:id="rId390">
+      <w:hyperlink r:id="rId409">
         <w:r>
           <w:rPr>
             <w:lang w:val="ar_AE" w:bidi="ar_AE"/>
@@ -12925,7 +13560,7 @@
         </w:rPr>
         <w:t xml:space="preserve"> في تلخيص نبوة العهد القديم (</w:t>
       </w:r>
-      <w:hyperlink r:id="rId396">
+      <w:hyperlink r:id="rId415">
         <w:r>
           <w:rPr>
             <w:lang w:val="ar_AE" w:bidi="ar_AE"/>
@@ -12943,7 +13578,7 @@
         </w:rPr>
         <w:t xml:space="preserve">) بنبوته "إِذْ سَبَقَ فَشَهِدَ بِٱلْآلَامِ ٱلَّتِي لِلْمَسِيحِ، وَٱلْأَمْجَادِ ٱلَّتِي بَعْدَهَا". يُدرِج بولس هذه العناصر (١ </w:t>
       </w:r>
-      <w:hyperlink r:id="rId397">
+      <w:hyperlink r:id="rId416">
         <w:r>
           <w:rPr>
             <w:lang w:val="ar_AE" w:bidi="ar_AE"/>
@@ -12961,7 +13596,7 @@
         </w:rPr>
         <w:t xml:space="preserve">؛ </w:t>
       </w:r>
-      <w:hyperlink r:id="rId398">
+      <w:hyperlink r:id="rId417">
         <w:r>
           <w:rPr>
             <w:lang w:val="ar_AE" w:bidi="ar_AE"/>
@@ -12979,7 +13614,7 @@
         </w:rPr>
         <w:t xml:space="preserve">؛ قارن </w:t>
       </w:r>
-      <w:hyperlink r:id="rId399">
+      <w:hyperlink r:id="rId418">
         <w:r>
           <w:rPr>
             <w:lang w:val="ar_AE" w:bidi="ar_AE"/>
@@ -12997,7 +13632,7 @@
         </w:rPr>
         <w:t xml:space="preserve">؛ </w:t>
       </w:r>
-      <w:hyperlink r:id="rId400">
+      <w:hyperlink r:id="rId419">
         <w:r>
           <w:rPr>
             <w:lang w:val="ar_AE" w:bidi="ar_AE"/>
@@ -13015,7 +13650,7 @@
         </w:rPr>
         <w:t xml:space="preserve">؛ </w:t>
       </w:r>
-      <w:hyperlink r:id="rId401">
+      <w:hyperlink r:id="rId420">
         <w:r>
           <w:rPr>
             <w:lang w:val="ar_AE" w:bidi="ar_AE"/>
@@ -13033,7 +13668,7 @@
         </w:rPr>
         <w:t xml:space="preserve">)، ولقب يوحنَّا "حَمَل الله" مُستَمد من </w:t>
       </w:r>
-      <w:hyperlink r:id="rId402">
+      <w:hyperlink r:id="rId421">
         <w:r>
           <w:rPr>
             <w:lang w:val="ar_AE" w:bidi="ar_AE"/>
@@ -13091,641 +13726,6 @@
           <w:lang w:val="ar_AE" w:bidi="ar_AE"/>
         </w:rPr>
         <w:t>سفر إشعياء</w:t>
-      </w:r>
-      <w:r>
-        <w:rPr>
-          <w:lang w:val="ar_AE" w:bidi="ar_AE"/>
-        </w:rPr>
-        <w:t>.</w:t>
-      </w:r>
-      <w:r>
-        <w:rPr>
-          <w:lang w:val="ar_AE" w:bidi="ar_AE"/>
-        </w:rPr>
-      </w:r>
-      <w:r>
-        <w:rPr>
-          <w:lang w:val="ar_AE" w:bidi="ar_AE"/>
-        </w:rPr>
-      </w:r>
-    </w:p>
-    <w:p>
-      <w:pPr>
-        <w:bidi/>
-      </w:pPr>
-      <w:r>
-        <w:rPr>
-          <w:lang w:val="ar_AE" w:bidi="ar_AE"/>
-        </w:rPr>
-      </w:r>
-    </w:p>
-    <w:p>
-      <w:pPr>
-        <w:pStyle w:val="Heading2"/>
-        <w:bidi/>
-      </w:pPr>
-      <w:r>
-        <w:rPr>
-          <w:lang w:val="ar_AE" w:bidi="ar_AE"/>
-        </w:rPr>
-        <w:t>خادمة</w:t>
-      </w:r>
-      <w:r>
-        <w:rPr>
-          <w:lang w:val="ar_AE" w:bidi="ar_AE"/>
-        </w:rPr>
-      </w:r>
-    </w:p>
-    <w:p>
-      <w:pPr>
-        <w:bidi/>
-      </w:pPr>
-      <w:r>
-        <w:rPr>
-          <w:lang w:val="ar_AE" w:bidi="ar_AE"/>
-        </w:rPr>
-      </w:r>
-      <w:r>
-        <w:rPr>
-          <w:lang w:val="ar_AE" w:bidi="ar_AE"/>
-        </w:rPr>
-        <w:t>امرأة شابة غير مُتَزَوَّجة، غالبًا من طبقة الخَدَّم. في العهد القديم، تُتَرجَم خمس كلمات عبرية ذات معاني مختلفة بالكلمة الإنجليزية "خادمة".</w:t>
-      </w:r>
-    </w:p>
-    <w:p>
-      <w:pPr>
-        <w:bidi/>
-      </w:pPr>
-      <w:r>
-        <w:rPr>
-          <w:lang w:val="ar_AE" w:bidi="ar_AE"/>
-        </w:rPr>
-      </w:r>
-      <w:r>
-        <w:rPr>
-          <w:lang w:val="ar_AE" w:bidi="ar_AE"/>
-        </w:rPr>
-        <w:t>واحدة من تلك الكلمات هي "</w:t>
-      </w:r>
-      <w:r>
-        <w:rPr>
-          <w:i/>
-          <w:lang w:val="ar_AE" w:bidi="ar_AE"/>
-        </w:rPr>
-        <w:t>أَمَة</w:t>
-      </w:r>
-      <w:r>
-        <w:rPr>
-          <w:lang w:val="ar_AE" w:bidi="ar_AE"/>
-        </w:rPr>
-        <w:t>". تشمل الترجمات العربية المختلفة لهذه الكلمة على الآتي: أَمَة، جارية، عبدة، مملوكة، قَيْنَة.</w:t>
-      </w:r>
-    </w:p>
-    <w:p>
-      <w:pPr>
-        <w:bidi/>
-      </w:pPr>
-      <w:r>
-        <w:rPr>
-          <w:lang w:val="ar_AE" w:bidi="ar_AE"/>
-        </w:rPr>
-      </w:r>
-      <w:r>
-        <w:rPr>
-          <w:lang w:val="ar_AE" w:bidi="ar_AE"/>
-        </w:rPr>
-        <w:t xml:space="preserve">مصطلح آخر هو </w:t>
-      </w:r>
-      <w:r>
-        <w:rPr>
-          <w:i/>
-          <w:lang w:val="ar_AE" w:bidi="ar_AE"/>
-        </w:rPr>
-        <w:t>شيفتشاه</w:t>
-      </w:r>
-      <w:r>
-        <w:rPr>
-          <w:lang w:val="ar_AE" w:bidi="ar_AE"/>
-        </w:rPr>
-        <w:t>. هذه الكلمة العبرية لها معنى مماثل لـلكلمة "</w:t>
-      </w:r>
-      <w:r>
-        <w:rPr>
-          <w:i/>
-          <w:lang w:val="ar_AE" w:bidi="ar_AE"/>
-        </w:rPr>
-        <w:t>أمة</w:t>
-      </w:r>
-      <w:r>
-        <w:rPr>
-          <w:lang w:val="ar_AE" w:bidi="ar_AE"/>
-        </w:rPr>
-        <w:t>". تُترْجَم بهذه الطرق، خادمة، وامرأة عبدة، وجارية. وعلى الرغم من أن كُلٍّ من شيفتشاه وآمة تشير إلى أنثى عبدة، شيفتشاه على ما يبدو تشير إلى وجود علاقة أوثق بين العبد والعائلة التي تنتمي إليها. وفي وقت الآباء هذا المصطلح في الأغلب يستخدم للإشارة إلى العبيد الإناث عمومًا وعلى وجه التحديد إلى المحظيات اللواتي كن أيضًا عبيدًا لزوجات أحرار لأزواجهن (</w:t>
-      </w:r>
-      <w:hyperlink r:id="rId403">
-        <w:r>
-          <w:rPr>
-            <w:lang w:val="ar_AE" w:bidi="ar_AE"/>
-          </w:rPr>
-          <w:rPr>
-            <w:color w:val="0000EE"/>
-            <w:u w:val="single"/>
-          </w:rPr>
-          <w:t>تكوين 16</w:t>
-        </w:r>
-      </w:hyperlink>
-      <w:r>
-        <w:rPr>
-          <w:lang w:val="ar_AE" w:bidi="ar_AE"/>
-        </w:rPr>
-        <w:t xml:space="preserve">، </w:t>
-      </w:r>
-      <w:hyperlink r:id="rId404">
-        <w:r>
-          <w:rPr>
-            <w:lang w:val="ar_AE" w:bidi="ar_AE"/>
-          </w:rPr>
-          <w:rPr>
-            <w:color w:val="0000EE"/>
-            <w:u w:val="single"/>
-          </w:rPr>
-          <w:t>29–30</w:t>
-        </w:r>
-      </w:hyperlink>
-      <w:r>
-        <w:rPr>
-          <w:lang w:val="ar_AE" w:bidi="ar_AE"/>
-        </w:rPr>
-        <w:t>).</w:t>
-      </w:r>
-    </w:p>
-    <w:p>
-      <w:pPr>
-        <w:bidi/>
-      </w:pPr>
-      <w:r>
-        <w:rPr>
-          <w:lang w:val="ar_AE" w:bidi="ar_AE"/>
-        </w:rPr>
-      </w:r>
-      <w:r>
-        <w:rPr>
-          <w:lang w:val="ar_AE" w:bidi="ar_AE"/>
-        </w:rPr>
-        <w:t>لا يزال مصطلح عبري آخر يعني "عذراء" وهو "</w:t>
-      </w:r>
-      <w:r>
-        <w:rPr>
-          <w:i/>
-          <w:lang w:val="ar_AE" w:bidi="ar_AE"/>
-        </w:rPr>
-        <w:t>بِتولاه</w:t>
-      </w:r>
-      <w:r>
-        <w:rPr>
-          <w:lang w:val="ar_AE" w:bidi="ar_AE"/>
-        </w:rPr>
-        <w:t>". يشير هذا المصطلح بالتحديد إلى الفتاة العذراء، أو الشابة التي في سن الزواج (</w:t>
-      </w:r>
-      <w:hyperlink r:id="rId405">
-        <w:r>
-          <w:rPr>
-            <w:lang w:val="ar_AE" w:bidi="ar_AE"/>
-          </w:rPr>
-          <w:rPr>
-            <w:color w:val="0000EE"/>
-            <w:u w:val="single"/>
-          </w:rPr>
-          <w:t>تكوين 24: 16</w:t>
-        </w:r>
-      </w:hyperlink>
-      <w:r>
-        <w:rPr>
-          <w:lang w:val="ar_AE" w:bidi="ar_AE"/>
-        </w:rPr>
-        <w:t xml:space="preserve">؛ </w:t>
-      </w:r>
-      <w:hyperlink r:id="rId406">
-        <w:r>
-          <w:rPr>
-            <w:lang w:val="ar_AE" w:bidi="ar_AE"/>
-          </w:rPr>
-          <w:rPr>
-            <w:color w:val="0000EE"/>
-            <w:u w:val="single"/>
-          </w:rPr>
-          <w:t>خروج 22: 16</w:t>
-        </w:r>
-      </w:hyperlink>
-      <w:r>
-        <w:rPr>
-          <w:lang w:val="ar_AE" w:bidi="ar_AE"/>
-        </w:rPr>
-        <w:t>). كان أنبياء العهد القديم يستخدمون أحيانًا هذا المصطلح مجازيًّا للإشارة إلى مدينة أو بلد على أنها "عذراء" (</w:t>
-      </w:r>
-      <w:hyperlink r:id="rId407">
-        <w:r>
-          <w:rPr>
-            <w:lang w:val="ar_AE" w:bidi="ar_AE"/>
-          </w:rPr>
-          <w:rPr>
-            <w:color w:val="0000EE"/>
-            <w:u w:val="single"/>
-          </w:rPr>
-          <w:t>إرميا 31: 21</w:t>
-        </w:r>
-      </w:hyperlink>
-      <w:r>
-        <w:rPr>
-          <w:lang w:val="ar_AE" w:bidi="ar_AE"/>
-        </w:rPr>
-        <w:t xml:space="preserve">؛ </w:t>
-      </w:r>
-      <w:hyperlink r:id="rId408">
-        <w:r>
-          <w:rPr>
-            <w:lang w:val="ar_AE" w:bidi="ar_AE"/>
-          </w:rPr>
-          <w:rPr>
-            <w:color w:val="0000EE"/>
-            <w:u w:val="single"/>
-          </w:rPr>
-          <w:t>عاموس 5: 2</w:t>
-        </w:r>
-      </w:hyperlink>
-      <w:r>
-        <w:rPr>
-          <w:lang w:val="ar_AE" w:bidi="ar_AE"/>
-        </w:rPr>
-        <w:t>).</w:t>
-      </w:r>
-    </w:p>
-    <w:p>
-      <w:pPr>
-        <w:bidi/>
-      </w:pPr>
-      <w:r>
-        <w:rPr>
-          <w:lang w:val="ar_AE" w:bidi="ar_AE"/>
-        </w:rPr>
-      </w:r>
-      <w:r>
-        <w:rPr>
-          <w:lang w:val="ar_AE" w:bidi="ar_AE"/>
-        </w:rPr>
-        <w:t xml:space="preserve">كلمة أخرى هي، </w:t>
-      </w:r>
-      <w:r>
-        <w:rPr>
-          <w:i/>
-          <w:lang w:val="ar_AE" w:bidi="ar_AE"/>
-        </w:rPr>
-        <w:t>نعَارَة</w:t>
-      </w:r>
-      <w:r>
-        <w:rPr>
-          <w:lang w:val="ar_AE" w:bidi="ar_AE"/>
-        </w:rPr>
-        <w:t>، في حد ذاتها تُستخدَم بعدة طرق في العهد القديم. غالبًا ما تشير إلى فتاة غير متزوجة (</w:t>
-      </w:r>
-      <w:hyperlink r:id="rId409">
-        <w:r>
-          <w:rPr>
-            <w:lang w:val="ar_AE" w:bidi="ar_AE"/>
-          </w:rPr>
-          <w:rPr>
-            <w:color w:val="0000EE"/>
-            <w:u w:val="single"/>
-          </w:rPr>
-          <w:t>أستير 2: 4</w:t>
-        </w:r>
-      </w:hyperlink>
-      <w:r>
-        <w:rPr>
-          <w:lang w:val="ar_AE" w:bidi="ar_AE"/>
-        </w:rPr>
-        <w:t>)؛ وفي أوقات أخرى تُستخدَم في الحديث عن الجواري (</w:t>
-      </w:r>
-      <w:hyperlink r:id="rId410">
-        <w:r>
-          <w:rPr>
-            <w:lang w:val="ar_AE" w:bidi="ar_AE"/>
-          </w:rPr>
-          <w:rPr>
-            <w:color w:val="0000EE"/>
-            <w:u w:val="single"/>
-          </w:rPr>
-          <w:t>أستير 4: 4</w:t>
-        </w:r>
-      </w:hyperlink>
-      <w:r>
-        <w:rPr>
-          <w:lang w:val="ar_AE" w:bidi="ar_AE"/>
-        </w:rPr>
-        <w:t xml:space="preserve">؛ </w:t>
-      </w:r>
-      <w:hyperlink r:id="rId411">
-        <w:r>
-          <w:rPr>
-            <w:lang w:val="ar_AE" w:bidi="ar_AE"/>
-          </w:rPr>
-          <w:rPr>
-            <w:color w:val="0000EE"/>
-            <w:u w:val="single"/>
-          </w:rPr>
-          <w:t>راعوث 2: 23</w:t>
-        </w:r>
-      </w:hyperlink>
-      <w:r>
-        <w:rPr>
-          <w:lang w:val="ar_AE" w:bidi="ar_AE"/>
-        </w:rPr>
-        <w:t xml:space="preserve">). هذه الكلمة نفسها هي الأصل لاسم امرأة (نَعْرَةُ، زوجة أَشْحُور، في </w:t>
-      </w:r>
-      <w:hyperlink r:id="rId412">
-        <w:r>
-          <w:rPr>
-            <w:lang w:val="ar_AE" w:bidi="ar_AE"/>
-          </w:rPr>
-          <w:rPr>
-            <w:color w:val="0000EE"/>
-            <w:u w:val="single"/>
-          </w:rPr>
-          <w:t>1 أخبار الأيام 4: 5–6</w:t>
-        </w:r>
-      </w:hyperlink>
-      <w:r>
-        <w:rPr>
-          <w:lang w:val="ar_AE" w:bidi="ar_AE"/>
-        </w:rPr>
-        <w:t>) ومدينة في أَفْرَايِم بالقرب من أريحا (</w:t>
-      </w:r>
-      <w:hyperlink r:id="rId413">
-        <w:r>
-          <w:rPr>
-            <w:lang w:val="ar_AE" w:bidi="ar_AE"/>
-          </w:rPr>
-          <w:rPr>
-            <w:color w:val="0000EE"/>
-            <w:u w:val="single"/>
-          </w:rPr>
-          <w:t>يشوع 16: 7</w:t>
-        </w:r>
-      </w:hyperlink>
-      <w:r>
-        <w:rPr>
-          <w:lang w:val="ar_AE" w:bidi="ar_AE"/>
-        </w:rPr>
-        <w:t>).</w:t>
-      </w:r>
-    </w:p>
-    <w:p>
-      <w:pPr>
-        <w:bidi/>
-      </w:pPr>
-      <w:r>
-        <w:rPr>
-          <w:lang w:val="ar_AE" w:bidi="ar_AE"/>
-        </w:rPr>
-      </w:r>
-      <w:r>
-        <w:rPr>
-          <w:lang w:val="ar_AE" w:bidi="ar_AE"/>
-        </w:rPr>
-        <w:t>لسنوات عديدة يحاط الجدل بمعنى"</w:t>
-      </w:r>
-      <w:r>
-        <w:rPr>
-          <w:i/>
-          <w:lang w:val="ar_AE" w:bidi="ar_AE"/>
-        </w:rPr>
-        <w:t>علما</w:t>
-      </w:r>
-      <w:r>
-        <w:rPr>
-          <w:lang w:val="ar_AE" w:bidi="ar_AE"/>
-        </w:rPr>
-        <w:t xml:space="preserve">"، اللفظة التي تعني عذراء ومستخدمة في </w:t>
-      </w:r>
-      <w:hyperlink r:id="rId414">
-        <w:r>
-          <w:rPr>
-            <w:lang w:val="ar_AE" w:bidi="ar_AE"/>
-          </w:rPr>
-          <w:rPr>
-            <w:color w:val="0000EE"/>
-            <w:u w:val="single"/>
-          </w:rPr>
-          <w:t>إشعياء 7: 14</w:t>
-        </w:r>
-      </w:hyperlink>
-      <w:r>
-        <w:rPr>
-          <w:lang w:val="ar_AE" w:bidi="ar_AE"/>
-        </w:rPr>
-        <w:t xml:space="preserve">. ينشأ هذا النزاع بسبب التعريفات المتنوعة للفظة في جميع أنحاء العهد القديم ("بنت"، "امرأة شابة"، "امرأة شابة في سن الزواج، ومن المفترض أنها عذراء"). وحده السياق هو الذي يستطيع أن يحدِّد بدقة معنى "علما" في أيِّ مثال مُعَطَّى به. بالنظر إلى </w:t>
-      </w:r>
-      <w:hyperlink r:id="rId414">
-        <w:r>
-          <w:rPr>
-            <w:lang w:val="ar_AE" w:bidi="ar_AE"/>
-          </w:rPr>
-          <w:rPr>
-            <w:color w:val="0000EE"/>
-            <w:u w:val="single"/>
-          </w:rPr>
-          <w:t>إشعياء 7: 14</w:t>
-        </w:r>
-      </w:hyperlink>
-      <w:r>
-        <w:rPr>
-          <w:lang w:val="ar_AE" w:bidi="ar_AE"/>
-        </w:rPr>
-        <w:t xml:space="preserve"> من منظور العهد الجديد، فإن "علما" هي إشارة إلى مريم العذراء، أم يسوع (اُنْظُرْ </w:t>
-      </w:r>
-      <w:hyperlink r:id="rId415">
-        <w:r>
-          <w:rPr>
-            <w:lang w:val="ar_AE" w:bidi="ar_AE"/>
-          </w:rPr>
-          <w:rPr>
-            <w:color w:val="0000EE"/>
-            <w:u w:val="single"/>
-          </w:rPr>
-          <w:t>مَتَّى 1: 23</w:t>
-        </w:r>
-      </w:hyperlink>
-      <w:r>
-        <w:rPr>
-          <w:lang w:val="ar_AE" w:bidi="ar_AE"/>
-        </w:rPr>
-        <w:t>).</w:t>
-      </w:r>
-    </w:p>
-    <w:p>
-      <w:pPr>
-        <w:bidi/>
-      </w:pPr>
-      <w:r>
-        <w:rPr>
-          <w:lang w:val="ar_AE" w:bidi="ar_AE"/>
-        </w:rPr>
-      </w:r>
-      <w:r>
-        <w:rPr>
-          <w:lang w:val="ar_AE" w:bidi="ar_AE"/>
-        </w:rPr>
-        <w:t>تُرَجَّمت عدة كلمات يونانيَّة إلى "عذراء" في العهد الجديد الإنجليزي. معنى كلمة "كوراسيون" هو ببساطة "بنت"، "فتاة صغيرة"، أو "عذراء" (</w:t>
-      </w:r>
-      <w:hyperlink r:id="rId416">
-        <w:r>
-          <w:rPr>
-            <w:lang w:val="ar_AE" w:bidi="ar_AE"/>
-          </w:rPr>
-          <w:rPr>
-            <w:color w:val="0000EE"/>
-            <w:u w:val="single"/>
-          </w:rPr>
-          <w:t>مَتَّى 9: 24–25</w:t>
-        </w:r>
-      </w:hyperlink>
-      <w:r>
-        <w:rPr>
-          <w:lang w:val="ar_AE" w:bidi="ar_AE"/>
-        </w:rPr>
-        <w:t>). كلمة أخرى هي "</w:t>
-      </w:r>
-      <w:r>
-        <w:rPr>
-          <w:i/>
-          <w:lang w:val="ar_AE" w:bidi="ar_AE"/>
-        </w:rPr>
-        <w:t>بايدسكي</w:t>
-      </w:r>
-      <w:r>
-        <w:rPr>
-          <w:lang w:val="ar_AE" w:bidi="ar_AE"/>
-        </w:rPr>
-        <w:t>"، والتي تُشير في الأصل إلى "امرأة شابة" لكنَّها أصبحت لاحقًا تعني "عبدة" أو "خادمة"، أو "فتاة خادمة" (</w:t>
-      </w:r>
-      <w:hyperlink r:id="rId417">
-        <w:r>
-          <w:rPr>
-            <w:lang w:val="ar_AE" w:bidi="ar_AE"/>
-          </w:rPr>
-          <w:rPr>
-            <w:color w:val="0000EE"/>
-            <w:u w:val="single"/>
-          </w:rPr>
-          <w:t>مَرْقُس 14: 66</w:t>
-        </w:r>
-      </w:hyperlink>
-      <w:r>
-        <w:rPr>
-          <w:lang w:val="ar_AE" w:bidi="ar_AE"/>
-        </w:rPr>
-        <w:t xml:space="preserve">؛ </w:t>
-      </w:r>
-      <w:hyperlink r:id="rId418">
-        <w:r>
-          <w:rPr>
-            <w:lang w:val="ar_AE" w:bidi="ar_AE"/>
-          </w:rPr>
-          <w:rPr>
-            <w:color w:val="0000EE"/>
-            <w:u w:val="single"/>
-          </w:rPr>
-          <w:t>لوقا 12: 45</w:t>
-        </w:r>
-      </w:hyperlink>
-      <w:r>
-        <w:rPr>
-          <w:lang w:val="ar_AE" w:bidi="ar_AE"/>
-        </w:rPr>
-        <w:t>). إنه تصغير كلمة "بايس" (وهي كلمة يونانية تشير إلى "فتاة صغيرة"، أو "عذراء"، أو "طفلة") (</w:t>
-      </w:r>
-      <w:hyperlink r:id="rId419">
-        <w:r>
-          <w:rPr>
-            <w:lang w:val="ar_AE" w:bidi="ar_AE"/>
-          </w:rPr>
-          <w:rPr>
-            <w:color w:val="0000EE"/>
-            <w:u w:val="single"/>
-          </w:rPr>
-          <w:t>لوقا 8: 51، 54</w:t>
-        </w:r>
-      </w:hyperlink>
-      <w:r>
-        <w:rPr>
-          <w:lang w:val="ar_AE" w:bidi="ar_AE"/>
-        </w:rPr>
-        <w:t>). الكلمة اليونانية "نِمْفِه" التي تعني "الزوجة الشابة" و"العروس" و"الكنَّة" (</w:t>
-      </w:r>
-      <w:hyperlink r:id="rId420">
-        <w:r>
-          <w:rPr>
-            <w:lang w:val="ar_AE" w:bidi="ar_AE"/>
-          </w:rPr>
-          <w:rPr>
-            <w:color w:val="0000EE"/>
-            <w:u w:val="single"/>
-          </w:rPr>
-          <w:t>لوقا 12: 53</w:t>
-        </w:r>
-      </w:hyperlink>
-      <w:r>
-        <w:rPr>
-          <w:lang w:val="ar_AE" w:bidi="ar_AE"/>
-        </w:rPr>
-        <w:t xml:space="preserve">؛ </w:t>
-      </w:r>
-      <w:hyperlink r:id="rId421">
-        <w:r>
-          <w:rPr>
-            <w:lang w:val="ar_AE" w:bidi="ar_AE"/>
-          </w:rPr>
-          <w:rPr>
-            <w:color w:val="0000EE"/>
-            <w:u w:val="single"/>
-          </w:rPr>
-          <w:t>رؤيا 21: 2</w:t>
-        </w:r>
-      </w:hyperlink>
-      <w:r>
-        <w:rPr>
-          <w:lang w:val="ar_AE" w:bidi="ar_AE"/>
-        </w:rPr>
-        <w:t>). وأيضًا "بارثينوس" هو المصطلح اليوناني المعتاد الذي يعني "عذراء" ويَرِد 14 مَرَّة في العهد الجديد.</w:t>
-      </w:r>
-    </w:p>
-    <w:p>
-      <w:pPr>
-        <w:bidi/>
-      </w:pPr>
-      <w:r>
-        <w:rPr>
-          <w:lang w:val="ar_AE" w:bidi="ar_AE"/>
-        </w:rPr>
-      </w:r>
-      <w:r>
-        <w:rPr>
-          <w:i/>
-          <w:lang w:val="ar_AE" w:bidi="ar_AE"/>
-        </w:rPr>
-        <w:t>انظر أيضًا</w:t>
-      </w:r>
-      <w:r>
-        <w:rPr>
-          <w:lang w:val="ar_AE" w:bidi="ar_AE"/>
-        </w:rPr>
-        <w:t xml:space="preserve"> </w:t>
-      </w:r>
-      <w:r>
-        <w:rPr>
-          <w:lang w:val="ar_AE" w:bidi="ar_AE"/>
-        </w:rPr>
-        <w:t>العبد، العبودية</w:t>
       </w:r>
       <w:r>
         <w:rPr>
@@ -18834,7 +18834,7 @@
         </w:rPr>
         <w:t>). قِيلَ لِزربابل إنه سُيصبح خاتمَ الله (</w:t>
       </w:r>
-      <w:hyperlink r:id="rId378">
+      <w:hyperlink r:id="rId397">
         <w:r>
           <w:rPr>
             <w:lang w:val="ar_AE" w:bidi="ar_AE"/>

</xml_diff>